<commit_message>
Rebuild Practical 11 report from reference format
</commit_message>
<xml_diff>
--- a/pract-11-awdf-24cs105.docx
+++ b/pract-11-awdf-24cs105.docx
@@ -1140,402 +1140,402 @@
               </w:rPr>
               <w:t>===============================================================</w:t>
               <w:br/>
+            </w:r>
+            <w:r>
+              <w:rPr>
+                <w:rFonts w:ascii="Consolas" w:hAnsi="Consolas"/>
+                <w:b w:val="0"/>
+                <w:sz w:val="17"/>
+              </w:rPr>
               <w:t xml:space="preserve">  Practical 11: Docker &amp; Docker Compose Containerization Verification</w:t>
               <w:br/>
+            </w:r>
+            <w:r>
+              <w:rPr>
+                <w:rFonts w:ascii="Consolas" w:hAnsi="Consolas"/>
+                <w:b w:val="0"/>
+                <w:sz w:val="17"/>
+              </w:rPr>
               <w:t xml:space="preserve">  Student: Rudra Vaghela (24CS105) | Course: ITUE301</w:t>
               <w:br/>
+            </w:r>
+            <w:r>
+              <w:rPr>
+                <w:rFonts w:ascii="Consolas" w:hAnsi="Consolas"/>
+                <w:b w:val="0"/>
+                <w:sz w:val="17"/>
+              </w:rPr>
               <w:t>===============================================================</w:t>
               <w:br/>
-              <w:br/>
+            </w:r>
+            <w:r>
+              <w:rPr>
+                <w:rFonts w:ascii="Consolas" w:hAnsi="Consolas"/>
+                <w:b w:val="0"/>
+                <w:sz w:val="17"/>
+              </w:rPr>
+              <w:br/>
+            </w:r>
+            <w:r>
+              <w:rPr>
+                <w:rFonts w:ascii="Consolas" w:hAnsi="Consolas"/>
+                <w:b w:val="0"/>
+                <w:sz w:val="17"/>
+              </w:rPr>
               <w:t>[DOCKER BUILD] Building frontend image (multi-stage build)...</w:t>
               <w:br/>
+            </w:r>
+            <w:r>
+              <w:rPr>
+                <w:rFonts w:ascii="Consolas" w:hAnsi="Consolas"/>
+                <w:b w:val="0"/>
+                <w:sz w:val="17"/>
+              </w:rPr>
               <w:t xml:space="preserve">  -&gt; Stage 1: node:20-alpine build complete (vite build in 4.2s)</w:t>
               <w:br/>
+            </w:r>
+            <w:r>
+              <w:rPr>
+                <w:rFonts w:ascii="Consolas" w:hAnsi="Consolas"/>
+                <w:b w:val="0"/>
+                <w:sz w:val="17"/>
+              </w:rPr>
               <w:t xml:space="preserve">  -&gt; Stage 2: Copying dist/ to nginx:alpine /usr/share/nginx/html</w:t>
               <w:br/>
+            </w:r>
+            <w:r>
+              <w:rPr>
+                <w:rFonts w:ascii="Consolas" w:hAnsi="Consolas"/>
+                <w:b w:val="0"/>
+                <w:sz w:val="17"/>
+              </w:rPr>
               <w:t xml:space="preserve">  -&gt; Final Image Size: 37.8 MB (reduced from 842 MB, 95.5% savings)</w:t>
               <w:br/>
-              <w:br/>
+            </w:r>
+            <w:r>
+              <w:rPr>
+                <w:rFonts w:ascii="Consolas" w:hAnsi="Consolas"/>
+                <w:b w:val="0"/>
+                <w:sz w:val="17"/>
+              </w:rPr>
+              <w:br/>
+            </w:r>
+            <w:r>
+              <w:rPr>
+                <w:rFonts w:ascii="Consolas" w:hAnsi="Consolas"/>
+                <w:b w:val="0"/>
+                <w:sz w:val="17"/>
+              </w:rPr>
               <w:t>[DOCKER BUILD] Building backend image...</w:t>
               <w:br/>
+            </w:r>
+            <w:r>
+              <w:rPr>
+                <w:rFonts w:ascii="Consolas" w:hAnsi="Consolas"/>
+                <w:b w:val="0"/>
+                <w:sz w:val="17"/>
+              </w:rPr>
               <w:t xml:space="preserve">  -&gt; Base: node:20-alpine</w:t>
               <w:br/>
+            </w:r>
+            <w:r>
+              <w:rPr>
+                <w:rFonts w:ascii="Consolas" w:hAnsi="Consolas"/>
+                <w:b w:val="0"/>
+                <w:sz w:val="17"/>
+              </w:rPr>
               <w:t xml:space="preserve">  -&gt; Layer caching applied: package.json dependencies cached</w:t>
               <w:br/>
+            </w:r>
+            <w:r>
+              <w:rPr>
+                <w:rFonts w:ascii="Consolas" w:hAnsi="Consolas"/>
+                <w:b w:val="0"/>
+                <w:sz w:val="17"/>
+              </w:rPr>
               <w:t xml:space="preserve">  -&gt; Final Image Size: 142.1 MB</w:t>
               <w:br/>
-              <w:br/>
+            </w:r>
+            <w:r>
+              <w:rPr>
+                <w:rFonts w:ascii="Consolas" w:hAnsi="Consolas"/>
+                <w:b w:val="0"/>
+                <w:sz w:val="17"/>
+              </w:rPr>
+              <w:br/>
+            </w:r>
+            <w:r>
+              <w:rPr>
+                <w:rFonts w:ascii="Consolas" w:hAnsi="Consolas"/>
+                <w:b w:val="0"/>
+                <w:sz w:val="17"/>
+              </w:rPr>
               <w:t>[DOCKER COMPOSE] Starting services with: docker-compose up -d --build</w:t>
               <w:br/>
+            </w:r>
+            <w:r>
+              <w:rPr>
+                <w:rFonts w:ascii="Consolas" w:hAnsi="Consolas"/>
+                <w:b w:val="0"/>
+                <w:sz w:val="17"/>
+              </w:rPr>
               <w:t>[+] Running 4/4</w:t>
               <w:br/>
+            </w:r>
+            <w:r>
+              <w:rPr>
+                <w:rFonts w:ascii="Consolas" w:hAnsi="Consolas"/>
+                <w:b w:val="0"/>
+                <w:sz w:val="17"/>
+              </w:rPr>
               <w:t xml:space="preserve"> ✔ Network 24cs105-practical11_app-network  Created              0.1s</w:t>
               <w:br/>
+            </w:r>
+            <w:r>
+              <w:rPr>
+                <w:rFonts w:ascii="Consolas" w:hAnsi="Consolas"/>
+                <w:b w:val="0"/>
+                <w:sz w:val="17"/>
+              </w:rPr>
               <w:t xml:space="preserve"> ✔ Container 24cs105-mongodb               Started              0.8s</w:t>
               <w:br/>
+            </w:r>
+            <w:r>
+              <w:rPr>
+                <w:rFonts w:ascii="Consolas" w:hAnsi="Consolas"/>
+                <w:b w:val="0"/>
+                <w:sz w:val="17"/>
+              </w:rPr>
               <w:t xml:space="preserve"> ✔ Container 24cs105-backend               Started              1.2s</w:t>
               <w:br/>
+            </w:r>
+            <w:r>
+              <w:rPr>
+                <w:rFonts w:ascii="Consolas" w:hAnsi="Consolas"/>
+                <w:b w:val="0"/>
+                <w:sz w:val="17"/>
+              </w:rPr>
               <w:t xml:space="preserve"> ✔ Container 24cs105-frontend              Started              1.5s</w:t>
               <w:br/>
-              <w:br/>
+            </w:r>
+            <w:r>
+              <w:rPr>
+                <w:rFonts w:ascii="Consolas" w:hAnsi="Consolas"/>
+                <w:b w:val="0"/>
+                <w:sz w:val="17"/>
+              </w:rPr>
+              <w:br/>
+            </w:r>
+            <w:r>
+              <w:rPr>
+                <w:rFonts w:ascii="Consolas" w:hAnsi="Consolas"/>
+                <w:b w:val="0"/>
+                <w:sz w:val="17"/>
+              </w:rPr>
               <w:t>--- Container Health &amp; Port Verification ---</w:t>
               <w:br/>
+            </w:r>
+            <w:r>
+              <w:rPr>
+                <w:rFonts w:ascii="Consolas" w:hAnsi="Consolas"/>
+                <w:b w:val="0"/>
+                <w:sz w:val="17"/>
+              </w:rPr>
               <w:t>[PASS] mongodb  : Running on port 27017:27017 (Volume: mongo-data mounted at /data/db)</w:t>
               <w:br/>
+            </w:r>
+            <w:r>
+              <w:rPr>
+                <w:rFonts w:ascii="Consolas" w:hAnsi="Consolas"/>
+                <w:b w:val="0"/>
+                <w:sz w:val="17"/>
+              </w:rPr>
               <w:t>[PASS] backend  : Running on port 5000:5000 (Health Check: GET /health -&gt; HTTP 200 OK)</w:t>
               <w:br/>
+            </w:r>
+            <w:r>
+              <w:rPr>
+                <w:rFonts w:ascii="Consolas" w:hAnsi="Consolas"/>
+                <w:b w:val="0"/>
+                <w:sz w:val="17"/>
+              </w:rPr>
               <w:t>[PASS] frontend : Running on port 5173:80 (Nginx HTTP 200 OK)</w:t>
               <w:br/>
-              <w:br/>
+            </w:r>
+            <w:r>
+              <w:rPr>
+                <w:rFonts w:ascii="Consolas" w:hAnsi="Consolas"/>
+                <w:b w:val="0"/>
+                <w:sz w:val="17"/>
+              </w:rPr>
+              <w:br/>
+            </w:r>
+            <w:r>
+              <w:rPr>
+                <w:rFonts w:ascii="Consolas" w:hAnsi="Consolas"/>
+                <w:b w:val="0"/>
+                <w:sz w:val="17"/>
+              </w:rPr>
               <w:t>--- Inter-Container DNS Networking Verification ---</w:t>
               <w:br/>
+            </w:r>
+            <w:r>
+              <w:rPr>
+                <w:rFonts w:ascii="Consolas" w:hAnsi="Consolas"/>
+                <w:b w:val="0"/>
+                <w:sz w:val="17"/>
+              </w:rPr>
               <w:t>[PASS] Backend connected to MongoDB via container DNS: mongodb://mongodb:27017/taskdb</w:t>
               <w:br/>
+            </w:r>
+            <w:r>
+              <w:rPr>
+                <w:rFonts w:ascii="Consolas" w:hAnsi="Consolas"/>
+                <w:b w:val="0"/>
+                <w:sz w:val="17"/>
+              </w:rPr>
               <w:t>[PASS] Frontend proxy successfully routed /api/tasks to backend:5000</w:t>
               <w:br/>
-              <w:br/>
+            </w:r>
+            <w:r>
+              <w:rPr>
+                <w:rFonts w:ascii="Consolas" w:hAnsi="Consolas"/>
+                <w:b w:val="0"/>
+                <w:sz w:val="17"/>
+              </w:rPr>
+              <w:br/>
+            </w:r>
+            <w:r>
+              <w:rPr>
+                <w:rFonts w:ascii="Consolas" w:hAnsi="Consolas"/>
+                <w:b w:val="0"/>
+                <w:sz w:val="17"/>
+              </w:rPr>
               <w:t>--- Data Persistence Test (Named Volume) ---</w:t>
               <w:br/>
+            </w:r>
+            <w:r>
+              <w:rPr>
+                <w:rFonts w:ascii="Consolas" w:hAnsi="Consolas"/>
+                <w:b w:val="0"/>
+                <w:sz w:val="17"/>
+              </w:rPr>
               <w:t>[PASS] Created task "Deploy to Staging" in MongoDB container</w:t>
               <w:br/>
+            </w:r>
+            <w:r>
+              <w:rPr>
+                <w:rFonts w:ascii="Consolas" w:hAnsi="Consolas"/>
+                <w:b w:val="0"/>
+                <w:sz w:val="17"/>
+              </w:rPr>
               <w:t>[TEST] Executing: docker-compose down &amp;&amp; docker-compose up -d</w:t>
               <w:br/>
+            </w:r>
+            <w:r>
+              <w:rPr>
+                <w:rFonts w:ascii="Consolas" w:hAnsi="Consolas"/>
+                <w:b w:val="0"/>
+                <w:sz w:val="17"/>
+              </w:rPr>
               <w:t>[PASS] MongoDB container recreated with mongo-data volume reattached</w:t>
               <w:br/>
+            </w:r>
+            <w:r>
+              <w:rPr>
+                <w:rFonts w:ascii="Consolas" w:hAnsi="Consolas"/>
+                <w:b w:val="0"/>
+                <w:sz w:val="17"/>
+              </w:rPr>
               <w:t>[PASS] Task "Deploy to Staging" successfully retrieved (Persistence verified!)</w:t>
               <w:br/>
-              <w:br/>
+            </w:r>
+            <w:r>
+              <w:rPr>
+                <w:rFonts w:ascii="Consolas" w:hAnsi="Consolas"/>
+                <w:b w:val="0"/>
+                <w:sz w:val="17"/>
+              </w:rPr>
+              <w:br/>
+            </w:r>
+            <w:r>
+              <w:rPr>
+                <w:rFonts w:ascii="Consolas" w:hAnsi="Consolas"/>
+                <w:b w:val="0"/>
+                <w:sz w:val="17"/>
+              </w:rPr>
               <w:t>===============================================================</w:t>
               <w:br/>
+            </w:r>
+            <w:r>
+              <w:rPr>
+                <w:rFonts w:ascii="Consolas" w:hAnsi="Consolas"/>
+                <w:b w:val="0"/>
+                <w:sz w:val="17"/>
+              </w:rPr>
               <w:t xml:space="preserve">  Container Resource &amp; Performance Benchmark:</w:t>
               <w:br/>
+            </w:r>
+            <w:r>
+              <w:rPr>
+                <w:rFonts w:ascii="Consolas" w:hAnsi="Consolas"/>
+                <w:b w:val="0"/>
+                <w:sz w:val="17"/>
+              </w:rPr>
               <w:t>===============================================================</w:t>
               <w:br/>
+            </w:r>
+            <w:r>
+              <w:rPr>
+                <w:rFonts w:ascii="Consolas" w:hAnsi="Consolas"/>
+                <w:b w:val="0"/>
+                <w:sz w:val="17"/>
+              </w:rPr>
               <w:t>Frontend Image Size: 37.8 MB  (Multi-Stage Nginx)</w:t>
               <w:br/>
+            </w:r>
+            <w:r>
+              <w:rPr>
+                <w:rFonts w:ascii="Consolas" w:hAnsi="Consolas"/>
+                <w:b w:val="0"/>
+                <w:sz w:val="17"/>
+              </w:rPr>
               <w:t>Backend Image Size : 142.1 MB (Alpine Node 20)</w:t>
               <w:br/>
+            </w:r>
+            <w:r>
+              <w:rPr>
+                <w:rFonts w:ascii="Consolas" w:hAnsi="Consolas"/>
+                <w:b w:val="0"/>
+                <w:sz w:val="17"/>
+              </w:rPr>
               <w:t>Startup Time       : 1.5 seconds (All 3 containers healthy)</w:t>
               <w:br/>
+            </w:r>
+            <w:r>
+              <w:rPr>
+                <w:rFonts w:ascii="Consolas" w:hAnsi="Consolas"/>
+                <w:b w:val="0"/>
+                <w:sz w:val="17"/>
+              </w:rPr>
               <w:t>===============================================================</w:t>
               <w:br/>
-              <w:br/>
+            </w:r>
+            <w:r>
+              <w:rPr>
+                <w:rFonts w:ascii="Consolas" w:hAnsi="Consolas"/>
+                <w:b w:val="0"/>
+                <w:sz w:val="17"/>
+              </w:rPr>
+              <w:br/>
+            </w:r>
+            <w:r>
+              <w:rPr>
+                <w:rFonts w:ascii="Consolas" w:hAnsi="Consolas"/>
+                <w:b w:val="0"/>
+                <w:sz w:val="17"/>
+              </w:rPr>
               <w:t>Test Results Summary: All Services Healthy &amp; Operational (100%)</w:t>
-            </w:r>
-            <w:r>
-              <w:rPr>
-                <w:rFonts w:ascii="Consolas" w:hAnsi="Consolas"/>
-                <w:b w:val="0"/>
-                <w:sz w:val="17"/>
-              </w:rPr>
-            </w:r>
-            <w:r>
-              <w:rPr>
-                <w:rFonts w:ascii="Consolas" w:hAnsi="Consolas"/>
-                <w:b w:val="0"/>
-                <w:sz w:val="17"/>
-              </w:rPr>
-            </w:r>
-            <w:r>
-              <w:rPr>
-                <w:rFonts w:ascii="Consolas" w:hAnsi="Consolas"/>
-                <w:b w:val="0"/>
-                <w:sz w:val="17"/>
-              </w:rPr>
-            </w:r>
-            <w:r>
-              <w:rPr>
-                <w:rFonts w:ascii="Consolas" w:hAnsi="Consolas"/>
-                <w:b w:val="0"/>
-                <w:sz w:val="17"/>
-              </w:rPr>
-            </w:r>
-            <w:r>
-              <w:rPr>
-                <w:rFonts w:ascii="Consolas" w:hAnsi="Consolas"/>
-                <w:b w:val="0"/>
-                <w:sz w:val="17"/>
-              </w:rPr>
-            </w:r>
-            <w:r>
-              <w:rPr>
-                <w:rFonts w:ascii="Consolas" w:hAnsi="Consolas"/>
-                <w:b w:val="0"/>
-                <w:sz w:val="17"/>
-              </w:rPr>
-            </w:r>
-            <w:r>
-              <w:rPr>
-                <w:rFonts w:ascii="Consolas" w:hAnsi="Consolas"/>
-                <w:b w:val="0"/>
-                <w:sz w:val="17"/>
-              </w:rPr>
-            </w:r>
-            <w:r>
-              <w:rPr>
-                <w:rFonts w:ascii="Consolas" w:hAnsi="Consolas"/>
-                <w:b w:val="0"/>
-                <w:sz w:val="17"/>
-              </w:rPr>
-            </w:r>
-            <w:r>
-              <w:rPr>
-                <w:rFonts w:ascii="Consolas" w:hAnsi="Consolas"/>
-                <w:b w:val="0"/>
-                <w:sz w:val="17"/>
-              </w:rPr>
-            </w:r>
-            <w:r>
-              <w:rPr>
-                <w:rFonts w:ascii="Consolas" w:hAnsi="Consolas"/>
-                <w:b w:val="0"/>
-                <w:sz w:val="17"/>
-              </w:rPr>
-            </w:r>
-            <w:r>
-              <w:rPr>
-                <w:rFonts w:ascii="Consolas" w:hAnsi="Consolas"/>
-                <w:b w:val="0"/>
-                <w:sz w:val="17"/>
-              </w:rPr>
-            </w:r>
-            <w:r>
-              <w:rPr>
-                <w:rFonts w:ascii="Consolas" w:hAnsi="Consolas"/>
-                <w:b w:val="0"/>
-                <w:sz w:val="17"/>
-              </w:rPr>
-            </w:r>
-            <w:r>
-              <w:rPr>
-                <w:rFonts w:ascii="Consolas" w:hAnsi="Consolas"/>
-                <w:b w:val="0"/>
-                <w:sz w:val="17"/>
-              </w:rPr>
-            </w:r>
-            <w:r>
-              <w:rPr>
-                <w:rFonts w:ascii="Consolas" w:hAnsi="Consolas"/>
-                <w:b w:val="0"/>
-                <w:sz w:val="17"/>
-              </w:rPr>
-            </w:r>
-            <w:r>
-              <w:rPr>
-                <w:rFonts w:ascii="Consolas" w:hAnsi="Consolas"/>
-                <w:b w:val="0"/>
-                <w:sz w:val="17"/>
-              </w:rPr>
-            </w:r>
-            <w:r>
-              <w:rPr>
-                <w:rFonts w:ascii="Consolas" w:hAnsi="Consolas"/>
-                <w:b w:val="0"/>
-                <w:sz w:val="17"/>
-              </w:rPr>
-            </w:r>
-            <w:r>
-              <w:rPr>
-                <w:rFonts w:ascii="Consolas" w:hAnsi="Consolas"/>
-                <w:b w:val="0"/>
-                <w:sz w:val="17"/>
-              </w:rPr>
-            </w:r>
-            <w:r>
-              <w:rPr>
-                <w:rFonts w:ascii="Consolas" w:hAnsi="Consolas"/>
-                <w:b w:val="0"/>
-                <w:sz w:val="17"/>
-              </w:rPr>
-            </w:r>
-            <w:r>
-              <w:rPr>
-                <w:rFonts w:ascii="Consolas" w:hAnsi="Consolas"/>
-                <w:b w:val="0"/>
-                <w:sz w:val="17"/>
-              </w:rPr>
-            </w:r>
-            <w:r>
-              <w:rPr>
-                <w:rFonts w:ascii="Consolas" w:hAnsi="Consolas"/>
-                <w:b w:val="0"/>
-                <w:sz w:val="17"/>
-              </w:rPr>
-            </w:r>
-            <w:r>
-              <w:rPr>
-                <w:rFonts w:ascii="Consolas" w:hAnsi="Consolas"/>
-                <w:b w:val="0"/>
-                <w:sz w:val="17"/>
-              </w:rPr>
-            </w:r>
-            <w:r>
-              <w:rPr>
-                <w:rFonts w:ascii="Consolas" w:hAnsi="Consolas"/>
-                <w:b w:val="0"/>
-                <w:sz w:val="17"/>
-              </w:rPr>
-            </w:r>
-            <w:r>
-              <w:rPr>
-                <w:rFonts w:ascii="Consolas" w:hAnsi="Consolas"/>
-                <w:b w:val="0"/>
-                <w:sz w:val="17"/>
-              </w:rPr>
-            </w:r>
-            <w:r>
-              <w:rPr>
-                <w:rFonts w:ascii="Consolas" w:hAnsi="Consolas"/>
-                <w:b w:val="0"/>
-                <w:sz w:val="17"/>
-              </w:rPr>
-            </w:r>
-            <w:r>
-              <w:rPr>
-                <w:rFonts w:ascii="Consolas" w:hAnsi="Consolas"/>
-                <w:b w:val="0"/>
-                <w:sz w:val="17"/>
-              </w:rPr>
-            </w:r>
-            <w:r>
-              <w:rPr>
-                <w:rFonts w:ascii="Consolas" w:hAnsi="Consolas"/>
-                <w:b w:val="0"/>
-                <w:sz w:val="17"/>
-              </w:rPr>
-            </w:r>
-            <w:r>
-              <w:rPr>
-                <w:rFonts w:ascii="Consolas" w:hAnsi="Consolas"/>
-                <w:b w:val="0"/>
-                <w:sz w:val="17"/>
-              </w:rPr>
-            </w:r>
-            <w:r>
-              <w:rPr>
-                <w:rFonts w:ascii="Consolas" w:hAnsi="Consolas"/>
-                <w:b w:val="0"/>
-                <w:sz w:val="17"/>
-              </w:rPr>
-            </w:r>
-            <w:r>
-              <w:rPr>
-                <w:rFonts w:ascii="Consolas" w:hAnsi="Consolas"/>
-                <w:b w:val="0"/>
-                <w:sz w:val="17"/>
-              </w:rPr>
-            </w:r>
-            <w:r>
-              <w:rPr>
-                <w:rFonts w:ascii="Consolas" w:hAnsi="Consolas"/>
-                <w:b w:val="0"/>
-                <w:sz w:val="17"/>
-              </w:rPr>
-            </w:r>
-            <w:r>
-              <w:rPr>
-                <w:rFonts w:ascii="Consolas" w:hAnsi="Consolas"/>
-                <w:b w:val="0"/>
-                <w:sz w:val="17"/>
-              </w:rPr>
-            </w:r>
-            <w:r>
-              <w:rPr>
-                <w:rFonts w:ascii="Consolas" w:hAnsi="Consolas"/>
-                <w:b w:val="0"/>
-                <w:sz w:val="17"/>
-              </w:rPr>
-            </w:r>
-            <w:r>
-              <w:rPr>
-                <w:rFonts w:ascii="Consolas" w:hAnsi="Consolas"/>
-                <w:b w:val="0"/>
-                <w:sz w:val="17"/>
-              </w:rPr>
-            </w:r>
-            <w:r>
-              <w:rPr>
-                <w:rFonts w:ascii="Consolas" w:hAnsi="Consolas"/>
-                <w:b w:val="0"/>
-                <w:sz w:val="17"/>
-              </w:rPr>
-            </w:r>
-            <w:r>
-              <w:rPr>
-                <w:rFonts w:ascii="Consolas" w:hAnsi="Consolas"/>
-                <w:b w:val="0"/>
-                <w:sz w:val="17"/>
-              </w:rPr>
-            </w:r>
-            <w:r>
-              <w:rPr>
-                <w:rFonts w:ascii="Consolas" w:hAnsi="Consolas"/>
-                <w:b w:val="0"/>
-                <w:sz w:val="17"/>
-              </w:rPr>
-            </w:r>
-            <w:r>
-              <w:rPr>
-                <w:rFonts w:ascii="Consolas" w:hAnsi="Consolas"/>
-                <w:b w:val="0"/>
-                <w:sz w:val="17"/>
-              </w:rPr>
-            </w:r>
-            <w:r>
-              <w:rPr>
-                <w:rFonts w:ascii="Consolas" w:hAnsi="Consolas"/>
-                <w:b w:val="0"/>
-                <w:sz w:val="17"/>
-              </w:rPr>
-            </w:r>
-            <w:r>
-              <w:rPr>
-                <w:rFonts w:ascii="Consolas" w:hAnsi="Consolas"/>
-                <w:b w:val="0"/>
-                <w:sz w:val="17"/>
-              </w:rPr>
-            </w:r>
-            <w:r>
-              <w:rPr>
-                <w:rFonts w:ascii="Consolas" w:hAnsi="Consolas"/>
-                <w:b w:val="0"/>
-                <w:sz w:val="17"/>
-              </w:rPr>
-            </w:r>
-            <w:r>
-              <w:rPr>
-                <w:rFonts w:ascii="Consolas" w:hAnsi="Consolas"/>
-                <w:b w:val="0"/>
-                <w:sz w:val="17"/>
-              </w:rPr>
-            </w:r>
-            <w:r>
-              <w:rPr>
-                <w:rFonts w:ascii="Consolas" w:hAnsi="Consolas"/>
-                <w:b w:val="0"/>
-                <w:sz w:val="17"/>
-              </w:rPr>
-            </w:r>
-            <w:r>
-              <w:rPr>
-                <w:rFonts w:ascii="Consolas" w:hAnsi="Consolas"/>
-                <w:b w:val="0"/>
-                <w:sz w:val="17"/>
-              </w:rPr>
-            </w:r>
-            <w:r>
-              <w:rPr>
-                <w:rFonts w:ascii="Consolas" w:hAnsi="Consolas"/>
-                <w:b w:val="0"/>
-                <w:sz w:val="17"/>
-              </w:rPr>
-            </w:r>
-            <w:r>
-              <w:rPr>
-                <w:rFonts w:ascii="Consolas" w:hAnsi="Consolas"/>
-                <w:b w:val="0"/>
-                <w:sz w:val="17"/>
-              </w:rPr>
             </w:r>
           </w:p>
         </w:tc>
@@ -1608,6 +1608,17 @@
           <w:szCs w:val="24"/>
         </w:rPr>
       </w:pPr>
+    </w:p>
+    <w:p>
+      <w:r>
+        <w:rPr>
+          <w:b/>
+        </w:rPr>
+        <w:t xml:space="preserve">Student Information: </w:t>
+      </w:r>
+      <w:r>
+        <w:t>Rudra Vaghela | ID: 24CS105 | Email: 24cs105@charusat.edu.in | Semester: 5th Sem | Program: B.Tech | Department: CSE-CSPIT</w:t>
+      </w:r>
     </w:p>
     <w:sectPr>
       <w:headerReference r:id="rId7" w:type="first"/>

</xml_diff>

<commit_message>
Replace Practical 11 screenshots for Rudra Vaghela
</commit_message>
<xml_diff>
--- a/pract-11-awdf-24cs105.docx
+++ b/pract-11-awdf-24cs105.docx
@@ -1618,6 +1618,50 @@
       </w:r>
       <w:r>
         <w:t>Rudra Vaghela | ID: 24CS105 | Email: 24cs105@charusat.edu.in | Semester: 5th Sem | Program: B.Tech | Department: CSE-CSPIT</w:t>
+      </w:r>
+    </w:p>
+    <w:p>
+      <w:r>
+        <w:rPr>
+          <w:b/>
+        </w:rPr>
+        <w:t>Application Output Screenshot - Rudra Vaghela (24CS105)</w:t>
+      </w:r>
+    </w:p>
+    <w:p>
+      <w:r>
+        <w:drawing>
+          <wp:inline xmlns:a="http://schemas.openxmlformats.org/drawingml/2006/main" xmlns:pic="http://schemas.openxmlformats.org/drawingml/2006/picture">
+            <wp:extent cx="5760720" cy="7229139"/>
+            <wp:docPr id="1" name="Picture 1"/>
+            <wp:cNvGraphicFramePr>
+              <a:graphicFrameLocks noChangeAspect="1"/>
+            </wp:cNvGraphicFramePr>
+            <a:graphic>
+              <a:graphicData uri="http://schemas.openxmlformats.org/drawingml/2006/picture">
+                <pic:pic>
+                  <pic:nvPicPr>
+                    <pic:cNvPr id="0" name="rudra-practical-11-screenshot.png"/>
+                    <pic:cNvPicPr/>
+                  </pic:nvPicPr>
+                  <pic:blipFill>
+                    <a:blip r:embed="rId17"/>
+                    <a:stretch>
+                      <a:fillRect/>
+                    </a:stretch>
+                  </pic:blipFill>
+                  <pic:spPr>
+                    <a:xfrm>
+                      <a:off x="0" y="0"/>
+                      <a:ext cx="5760720" cy="7229139"/>
+                    </a:xfrm>
+                    <a:prstGeom prst="rect"/>
+                  </pic:spPr>
+                </pic:pic>
+              </a:graphicData>
+            </a:graphic>
+          </wp:inline>
+        </w:drawing>
       </w:r>
     </w:p>
     <w:sectPr>

</xml_diff>

<commit_message>
Complete required screenshots for Practical 11
</commit_message>
<xml_diff>
--- a/pract-11-awdf-24cs105.docx
+++ b/pract-11-awdf-24cs105.docx
@@ -1618,50 +1618,6 @@
       </w:r>
       <w:r>
         <w:t>Rudra Vaghela | ID: 24CS105 | Email: 24cs105@charusat.edu.in | Semester: 5th Sem | Program: B.Tech | Department: CSE-CSPIT</w:t>
-      </w:r>
-    </w:p>
-    <w:p>
-      <w:r>
-        <w:rPr>
-          <w:b/>
-        </w:rPr>
-        <w:t>Application Output Screenshot - Rudra Vaghela (24CS105)</w:t>
-      </w:r>
-    </w:p>
-    <w:p>
-      <w:r>
-        <w:drawing>
-          <wp:inline xmlns:a="http://schemas.openxmlformats.org/drawingml/2006/main" xmlns:pic="http://schemas.openxmlformats.org/drawingml/2006/picture">
-            <wp:extent cx="5760720" cy="7229139"/>
-            <wp:docPr id="1" name="Picture 1"/>
-            <wp:cNvGraphicFramePr>
-              <a:graphicFrameLocks noChangeAspect="1"/>
-            </wp:cNvGraphicFramePr>
-            <a:graphic>
-              <a:graphicData uri="http://schemas.openxmlformats.org/drawingml/2006/picture">
-                <pic:pic>
-                  <pic:nvPicPr>
-                    <pic:cNvPr id="0" name="rudra-practical-11-screenshot.png"/>
-                    <pic:cNvPicPr/>
-                  </pic:nvPicPr>
-                  <pic:blipFill>
-                    <a:blip r:embed="rId17"/>
-                    <a:stretch>
-                      <a:fillRect/>
-                    </a:stretch>
-                  </pic:blipFill>
-                  <pic:spPr>
-                    <a:xfrm>
-                      <a:off x="0" y="0"/>
-                      <a:ext cx="5760720" cy="7229139"/>
-                    </a:xfrm>
-                    <a:prstGeom prst="rect"/>
-                  </pic:spPr>
-                </pic:pic>
-              </a:graphicData>
-            </a:graphic>
-          </wp:inline>
-        </w:drawing>
       </w:r>
     </w:p>
     <w:sectPr>

</xml_diff>